<commit_message>
srs: group-voice fix (Mahd + Arwa) - shared-repo wording per D-018
</commit_message>
<xml_diff>
--- a/prototype/docs/SRS.docx
+++ b/prototype/docs/SRS.docx
@@ -669,7 +669,7 @@
       <w:pPr/>
       <w:r>
         <w:rPr/>
-        <w:t xml:space="preserve">Single-machine demo; Python + Flask server-rendered UI (Tabler design system, vendored, offline-safe, no build step); SQLite demo database; pytest + GitHub Actions CI. No cloud services required in mock mode.</w:t>
+        <w:t xml:space="preserve">Single-machine demo; Python + Flask API + a built React SPA frontend (TypeScript, Vite, shadcn/ui + Tailwind - built at dev time, served statically by Flask, offline-safe at runtime); SQLite demo database; pytest (API/engine) + vitest (frontend) + GitHub Actions CI. No cloud services required in mock mode.</w:t>
       </w:r>
     </w:p>
     <w:p>
@@ -808,7 +808,7 @@
       <w:pPr/>
       <w:r>
         <w:rPr/>
-        <w:t xml:space="preserve">Two-person group (operator + Arwa) with named lanes; midterm date TBA (requirement document is the by-midterm deliverable, restated by Chen on Sep 3 and Sep 8); demo-scale data volumes; AI-usage policy for deliverables not yet stated on any captured course surface (open item).</w:t>
+        <w:t xml:space="preserve">Two-person group (Mahd + Arwa) with named lanes; midterm date TBA (requirement document is the by-midterm deliverable, restated by Chen on Sep 3 and Sep 8); demo-scale data volumes; AI-usage policy for deliverables not yet stated on any captured course surface (open item).</w:t>
       </w:r>
     </w:p>
     <w:p>
@@ -2605,7 +2605,7 @@
       </w:pPr>
       <w:r>
         <w:rPr/>
-        <w:t xml:space="preserve">Group review notes: operator-side conversation, folded in as received - not a submission gate.</w:t>
+        <w:t xml:space="preserve">Group review notes: folded in as received - not a submission gate.</w:t>
       </w:r>
     </w:p>
     <w:p>
@@ -2617,7 +2617,7 @@
       </w:pPr>
       <w:r>
         <w:rPr/>
-        <w:t xml:space="preserve">AI-usage policy for deliverables: not stated on any captured course surface.</w:t>
+        <w:t xml:space="preserve">AI-usage policy for deliverables: no course-stated policy exists; the operator rule applies (AI tools used in development, per course allowances where stated). Settled 09-15 - not a gate.</w:t>
       </w:r>
     </w:p>
     <w:p>

</xml_diff>

<commit_message>
docs: regenerate SRS artifacts after em-dash purge
</commit_message>
<xml_diff>
--- a/prototype/docs/SRS.docx
+++ b/prototype/docs/SRS.docx
@@ -41,7 +41,7 @@
         <w:t xml:space="preserve">Structure:</w:t>
       </w:r>
       <w:r>
-        <w:t xml:space="preserve"> IEEE-830 shaped (the course-confirmed spec form); IEEE-830 was withdrawn and superseded by ISO/IEC/IEEE 29148 — section naming here follows the familiar 830 layout with 29148 terminology. </w:t>
+        <w:t xml:space="preserve"> IEEE-830 shaped (the course-confirmed spec form); IEEE-830 was withdrawn and superseded by ISO/IEC/IEEE 29148: section naming here follows the familiar 830 layout with 29148 terminology. </w:t>
       </w:r>
       <w:r>
         <w:rPr>
@@ -2418,7 +2418,7 @@
       </w:pPr>
       <w:r>
         <w:rPr/>
-        <w:t xml:space="preserve">exact-verdict match on read_exfiltration: 55.6% — the remainder returned MASK (private columns removed), the designed outcome; the safety-relevant leak rate is 0. Reported separately so the number stays honest (D-008).</w:t>
+        <w:t xml:space="preserve">exact-verdict match on read_exfiltration: 55.6%: the remainder returned MASK (private columns removed), the designed outcome; the safety-relevant leak rate is 0. Reported separately so the number stays honest (D-008).</w:t>
       </w:r>
     </w:p>
     <w:p>
@@ -2564,7 +2564,7 @@
         <w:t xml:space="preserve">Security practices</w:t>
       </w:r>
       <w:r>
-        <w:t xml:space="preserve"> (lecture Aug 27): masking vs tokenization, least privilege, read-only enforcement — all demonstrated by the gate.</w:t>
+        <w:t xml:space="preserve"> (lecture Aug 27): masking vs tokenization, least privilege, read-only enforcement: all demonstrated by the gate.</w:t>
       </w:r>
     </w:p>
     <w:p>

</xml_diff>